<commit_message>
cct: add POL 1.1 resilience revision
</commit_message>
<xml_diff>
--- a/research/active/cct/output/docx/CCT-livre-blanc.docx
+++ b/research/active/cct/output/docx/CCT-livre-blanc.docx
@@ -86,7 +86,7 @@
           <w:color w:val="66737D"/>
           <w:sz w:val="22"/>
         </w:rPr>
-        <w:t>ÉTAT DE RECHERCHE  •  AOÛT 2026</w:t>
+        <w:t>ÉTAT DE RECHERCHE  •  SEPTEMBRE 2026</w:t>
       </w:r>
     </w:p>
     <w:p>
@@ -383,6 +383,20 @@
           <w:color w:val="24323D"/>
           <w:sz w:val="17"/>
         </w:rPr>
+        <w:t>Révision CCT POL 1 1 Marges et contre champ</w:t>
+      </w:r>
+    </w:p>
+    <w:p>
+      <w:pPr>
+        <w:spacing w:after="30" w:line="240" w:lineRule="auto"/>
+        <w:ind w:left="259"/>
+      </w:pPr>
+      <w:r>
+        <w:rPr>
+          <w:rFonts w:ascii="Aptos" w:hAnsi="Aptos"/>
+          <w:color w:val="24323D"/>
+          <w:sz w:val="17"/>
+        </w:rPr>
         <w:t>16. Cycle de maintenance constitutionnelle</w:t>
       </w:r>
     </w:p>
@@ -584,7 +598,7 @@
           <w:rFonts w:ascii="Aptos" w:hAnsi="Aptos"/>
           <w:color w:val="24323D"/>
         </w:rPr>
-        <w:t xml:space="preserve"> Garantir à chacun les conditions matérielles d’une vie libre ; protéger les limites écologiques communes ; distribuer l’initiative, l’exécution, le contrôle, le recours et l’arrêt de tout pouvoir.</w:t>
+        <w:t xml:space="preserve"> Garantir à chacun les conditions matérielles d’une vie libre ; protéger les limites écologiques communes ; distribuer l’initiative, l’exécution, le contrôle, le recours et l’arrêt de tout pouvoir. Chercher systématiquement le contre-champ des décisions, et juger leur réussite à la capacité réellement préservée plutôt qu’à l’argent dépensé ou aux intentions déclarées.</w:t>
       </w:r>
     </w:p>
     <w:p>
@@ -656,6 +670,15 @@
           <w:color w:val="24323D"/>
         </w:rPr>
         <w:t xml:space="preserve"> désignent ici des exigences normatives. Un droit n’est effectif que lorsqu’une personne peut l’exercer dans des conditions dégradées, obtenir une réponse, contester un refus et faire réparer une perte. Une règle écrite, un prototype logiciel ou une institution déclarée ne suffisent pas.</w:t>
+      </w:r>
+    </w:p>
+    <w:p>
+      <w:r>
+        <w:rPr>
+          <w:rFonts w:ascii="Aptos" w:hAnsi="Aptos"/>
+          <w:color w:val="24323D"/>
+        </w:rPr>
+        <w:t>La version actuelle rend aussi explicite une règle d’attribution : aucun pouvoir, privilège ou dommage ne peut être imputé à une identité collective. Il faut démontrer un mécanisme — propriété, financement, décision, contrôle d’une ressource, acte ou effet — et conserver les limites de la preuve.</w:t>
       </w:r>
     </w:p>
     <w:p>
@@ -1504,6 +1527,7 @@
       <w:tr>
         <w:trPr>
           <w:tblHeader w:val="true"/>
+          <w:cantSplit w:val="true"/>
         </w:trPr>
         <w:tc>
           <w:tcPr>
@@ -1682,6 +1706,9 @@
         </w:tc>
       </w:tr>
       <w:tr>
+        <w:trPr>
+          <w:cantSplit w:val="true"/>
+        </w:trPr>
         <w:tc>
           <w:tcPr>
             <w:tcW w:type="dxa" w:w="3000"/>
@@ -1854,6 +1881,9 @@
         </w:tc>
       </w:tr>
       <w:tr>
+        <w:trPr>
+          <w:cantSplit w:val="true"/>
+        </w:trPr>
         <w:tc>
           <w:tcPr>
             <w:tcW w:type="dxa" w:w="3000"/>
@@ -2031,6 +2061,9 @@
         </w:tc>
       </w:tr>
       <w:tr>
+        <w:trPr>
+          <w:cantSplit w:val="true"/>
+        </w:trPr>
         <w:tc>
           <w:tcPr>
             <w:tcW w:type="dxa" w:w="3000"/>
@@ -2203,6 +2236,9 @@
         </w:tc>
       </w:tr>
       <w:tr>
+        <w:trPr>
+          <w:cantSplit w:val="true"/>
+        </w:trPr>
         <w:tc>
           <w:tcPr>
             <w:tcW w:type="dxa" w:w="3000"/>
@@ -2380,6 +2416,9 @@
         </w:tc>
       </w:tr>
       <w:tr>
+        <w:trPr>
+          <w:cantSplit w:val="true"/>
+        </w:trPr>
         <w:tc>
           <w:tcPr>
             <w:tcW w:type="dxa" w:w="3000"/>
@@ -2552,6 +2591,9 @@
         </w:tc>
       </w:tr>
       <w:tr>
+        <w:trPr>
+          <w:cantSplit w:val="true"/>
+        </w:trPr>
         <w:tc>
           <w:tcPr>
             <w:tcW w:type="dxa" w:w="3000"/>
@@ -2729,6 +2771,9 @@
         </w:tc>
       </w:tr>
       <w:tr>
+        <w:trPr>
+          <w:cantSplit w:val="true"/>
+        </w:trPr>
         <w:tc>
           <w:tcPr>
             <w:tcW w:type="dxa" w:w="3000"/>
@@ -2901,6 +2946,9 @@
         </w:tc>
       </w:tr>
       <w:tr>
+        <w:trPr>
+          <w:cantSplit w:val="true"/>
+        </w:trPr>
         <w:tc>
           <w:tcPr>
             <w:tcW w:type="dxa" w:w="3000"/>
@@ -5219,6 +5267,7 @@
       <w:tr>
         <w:trPr>
           <w:tblHeader w:val="true"/>
+          <w:cantSplit w:val="true"/>
         </w:trPr>
         <w:tc>
           <w:tcPr>
@@ -5327,6 +5376,9 @@
         </w:tc>
       </w:tr>
       <w:tr>
+        <w:trPr>
+          <w:cantSplit w:val="true"/>
+        </w:trPr>
         <w:tc>
           <w:tcPr>
             <w:tcW w:type="dxa" w:w="2200"/>
@@ -5431,6 +5483,9 @@
         </w:tc>
       </w:tr>
       <w:tr>
+        <w:trPr>
+          <w:cantSplit w:val="true"/>
+        </w:trPr>
         <w:tc>
           <w:tcPr>
             <w:tcW w:type="dxa" w:w="2200"/>
@@ -5538,6 +5593,9 @@
         </w:tc>
       </w:tr>
       <w:tr>
+        <w:trPr>
+          <w:cantSplit w:val="true"/>
+        </w:trPr>
         <w:tc>
           <w:tcPr>
             <w:tcW w:type="dxa" w:w="2200"/>
@@ -5642,6 +5700,9 @@
         </w:tc>
       </w:tr>
       <w:tr>
+        <w:trPr>
+          <w:cantSplit w:val="true"/>
+        </w:trPr>
         <w:tc>
           <w:tcPr>
             <w:tcW w:type="dxa" w:w="2200"/>
@@ -5749,6 +5810,9 @@
         </w:tc>
       </w:tr>
       <w:tr>
+        <w:trPr>
+          <w:cantSplit w:val="true"/>
+        </w:trPr>
         <w:tc>
           <w:tcPr>
             <w:tcW w:type="dxa" w:w="2200"/>
@@ -5853,6 +5917,9 @@
         </w:tc>
       </w:tr>
       <w:tr>
+        <w:trPr>
+          <w:cantSplit w:val="true"/>
+        </w:trPr>
         <w:tc>
           <w:tcPr>
             <w:tcW w:type="dxa" w:w="2200"/>
@@ -5960,6 +6027,9 @@
         </w:tc>
       </w:tr>
       <w:tr>
+        <w:trPr>
+          <w:cantSplit w:val="true"/>
+        </w:trPr>
         <w:tc>
           <w:tcPr>
             <w:tcW w:type="dxa" w:w="2200"/>
@@ -6064,6 +6134,9 @@
         </w:tc>
       </w:tr>
       <w:tr>
+        <w:trPr>
+          <w:cantSplit w:val="true"/>
+        </w:trPr>
         <w:tc>
           <w:tcPr>
             <w:tcW w:type="dxa" w:w="2200"/>
@@ -6580,6 +6653,59 @@
         <w:pStyle w:val="Heading2"/>
       </w:pPr>
       <w:r>
+        <w:t>Révision CCT POL 1 1 Marges et contre champ</w:t>
+      </w:r>
+    </w:p>
+    <w:p>
+      <w:r>
+        <w:rPr>
+          <w:rFonts w:ascii="Aptos" w:hAnsi="Aptos"/>
+          <w:color w:val="24323D"/>
+        </w:rPr>
+        <w:t>La CCT ne traite plus la résilience comme la promesse de prédire parfaitement un choc. Elle finance des marges distribuées : eau, énergie, soins, semences, alimentation, pièces de rechange, communications, voies analogiques et capacités locales de réparation. Une réserve n’est réelle que si elle est accessible, entretenue, exercée et indépendante de la panne qui frappe le système principal.</w:t>
+      </w:r>
+    </w:p>
+    <w:p>
+      <w:r>
+        <w:rPr>
+          <w:rFonts w:ascii="Aptos" w:hAnsi="Aptos"/>
+          <w:color w:val="24323D"/>
+        </w:rPr>
+        <w:t>Avant toute décision majeure, urgente ou irréversible, une instruction doit produire son contre-champ : personnes et écosystèmes absents, limites de détection, bénéficiaires et porteurs de coûts, détenteurs de veto, condition de renversement et capacité de recours des personnes affectées. Une identité collective ne remplace jamais la preuve d’un mécanisme de pouvoir, de responsabilité ou de traitement différentiel.</w:t>
+      </w:r>
+    </w:p>
+    <w:p>
+      <w:r>
+        <w:rPr>
+          <w:rFonts w:ascii="Aptos" w:hAnsi="Aptos"/>
+          <w:color w:val="24323D"/>
+        </w:rPr>
+        <w:t>La pluralité économique est bornée par une direction explicite. Le vital est démarchandisé ; les formes résiduelles de marché ou de propriété ne sont acceptables que si elles ne conditionnent ni un droit vital ni un plafond écologique, ne donnent pas un pouvoir proportionnel à la richesse, et sont retirées lorsqu’elles reconstituent rente, héritage concentré, monopole ou veto. Une coopérative qui reproduit ces capacités échoue au même test qu’une entreprise privée.</w:t>
+      </w:r>
+    </w:p>
+    <w:p>
+      <w:r>
+        <w:rPr>
+          <w:rFonts w:ascii="Aptos" w:hAnsi="Aptos"/>
+          <w:color w:val="24323D"/>
+        </w:rPr>
+        <w:t>Dans une crise, la priorité va aux situations où vulnérabilité, fenêtre d’action, irréversibilité, capacité locale d’exécution et possibilité de préserver une marge se rencontrent. Les travailleurs qui maintiennent eau, santé, alimentation, énergie, transport, communications et secours doivent disposer de protection, relève et droit de refus ; leur perte de capacité mettrait beaucoup d’autres personnes en danger. Les zones humides, bassins versants et autres amortisseurs écologiques existants bénéficient d’une présomption de protection plutôt que d’une promesse de restauration après dommage.</w:t>
+      </w:r>
+    </w:p>
+    <w:p>
+      <w:r>
+        <w:rPr>
+          <w:rFonts w:ascii="Aptos" w:hAnsi="Aptos"/>
+          <w:color w:val="24323D"/>
+        </w:rPr>
+        <w:t>Le cas réel El Niño 2026–2027 au Mozambique rend cette doctrine concrète sans prétendre valider la CCT : les sources publiques confirment les déclencheurs d’action anticipée, la nécessité de protéger eau, semences, actifs et continuité, mais elles ne permettent pas encore une allocation chiffrée par district ni une évaluation après choc. La CCT y désigne les responsabilités existantes et les rend contestables ; elle ne prétend pas se substituer aux institutions mozambicaines.</w:t>
+      </w:r>
+    </w:p>
+    <w:p>
+      <w:pPr>
+        <w:pStyle w:val="Heading2"/>
+      </w:pPr>
+      <w:r>
         <w:t>Charge constitutionnelle et polycrise</w:t>
       </w:r>
     </w:p>
@@ -6626,6 +6752,7 @@
       <w:tr>
         <w:trPr>
           <w:tblHeader w:val="true"/>
+          <w:cantSplit w:val="true"/>
         </w:trPr>
         <w:tc>
           <w:tcPr>
@@ -6734,6 +6861,9 @@
         </w:tc>
       </w:tr>
       <w:tr>
+        <w:trPr>
+          <w:cantSplit w:val="true"/>
+        </w:trPr>
         <w:tc>
           <w:tcPr>
             <w:tcW w:type="dxa" w:w="2200"/>
@@ -6838,6 +6968,9 @@
         </w:tc>
       </w:tr>
       <w:tr>
+        <w:trPr>
+          <w:cantSplit w:val="true"/>
+        </w:trPr>
         <w:tc>
           <w:tcPr>
             <w:tcW w:type="dxa" w:w="2200"/>
@@ -6945,6 +7078,9 @@
         </w:tc>
       </w:tr>
       <w:tr>
+        <w:trPr>
+          <w:cantSplit w:val="true"/>
+        </w:trPr>
         <w:tc>
           <w:tcPr>
             <w:tcW w:type="dxa" w:w="2200"/>
@@ -7049,6 +7185,9 @@
         </w:tc>
       </w:tr>
       <w:tr>
+        <w:trPr>
+          <w:cantSplit w:val="true"/>
+        </w:trPr>
         <w:tc>
           <w:tcPr>
             <w:tcW w:type="dxa" w:w="2200"/>
@@ -7156,6 +7295,9 @@
         </w:tc>
       </w:tr>
       <w:tr>
+        <w:trPr>
+          <w:cantSplit w:val="true"/>
+        </w:trPr>
         <w:tc>
           <w:tcPr>
             <w:tcW w:type="dxa" w:w="2200"/>
@@ -7260,6 +7402,9 @@
         </w:tc>
       </w:tr>
       <w:tr>
+        <w:trPr>
+          <w:cantSplit w:val="true"/>
+        </w:trPr>
         <w:tc>
           <w:tcPr>
             <w:tcW w:type="dxa" w:w="2200"/>
@@ -7367,6 +7512,9 @@
         </w:tc>
       </w:tr>
       <w:tr>
+        <w:trPr>
+          <w:cantSplit w:val="true"/>
+        </w:trPr>
         <w:tc>
           <w:tcPr>
             <w:tcW w:type="dxa" w:w="2200"/>
@@ -7471,6 +7619,9 @@
         </w:tc>
       </w:tr>
       <w:tr>
+        <w:trPr>
+          <w:cantSplit w:val="true"/>
+        </w:trPr>
         <w:tc>
           <w:tcPr>
             <w:tcW w:type="dxa" w:w="2200"/>
@@ -7578,6 +7729,9 @@
         </w:tc>
       </w:tr>
       <w:tr>
+        <w:trPr>
+          <w:cantSplit w:val="true"/>
+        </w:trPr>
         <w:tc>
           <w:tcPr>
             <w:tcW w:type="dxa" w:w="2200"/>
@@ -7682,6 +7836,9 @@
         </w:tc>
       </w:tr>
       <w:tr>
+        <w:trPr>
+          <w:cantSplit w:val="true"/>
+        </w:trPr>
         <w:tc>
           <w:tcPr>
             <w:tcW w:type="dxa" w:w="2200"/>
@@ -9483,6 +9640,7 @@
       <w:tr>
         <w:trPr>
           <w:tblHeader w:val="true"/>
+          <w:cantSplit w:val="true"/>
         </w:trPr>
         <w:tc>
           <w:tcPr>
@@ -9696,6 +9854,9 @@
         </w:tc>
       </w:tr>
       <w:tr>
+        <w:trPr>
+          <w:cantSplit w:val="true"/>
+        </w:trPr>
         <w:tc>
           <w:tcPr>
             <w:tcW w:type="dxa" w:w="1560"/>
@@ -9902,6 +10063,9 @@
         </w:tc>
       </w:tr>
       <w:tr>
+        <w:trPr>
+          <w:cantSplit w:val="true"/>
+        </w:trPr>
         <w:tc>
           <w:tcPr>
             <w:tcW w:type="dxa" w:w="1560"/>
@@ -10114,6 +10278,9 @@
         </w:tc>
       </w:tr>
       <w:tr>
+        <w:trPr>
+          <w:cantSplit w:val="true"/>
+        </w:trPr>
         <w:tc>
           <w:tcPr>
             <w:tcW w:type="dxa" w:w="1560"/>
@@ -10320,6 +10487,9 @@
         </w:tc>
       </w:tr>
       <w:tr>
+        <w:trPr>
+          <w:cantSplit w:val="true"/>
+        </w:trPr>
         <w:tc>
           <w:tcPr>
             <w:tcW w:type="dxa" w:w="1560"/>
@@ -10532,6 +10702,9 @@
         </w:tc>
       </w:tr>
       <w:tr>
+        <w:trPr>
+          <w:cantSplit w:val="true"/>
+        </w:trPr>
         <w:tc>
           <w:tcPr>
             <w:tcW w:type="dxa" w:w="1560"/>

</xml_diff>

<commit_message>
cct: add mobile continuity and resource vehicle
</commit_message>
<xml_diff>
--- a/research/active/cct/output/docx/CCT-livre-blanc.docx
+++ b/research/active/cct/output/docx/CCT-livre-blanc.docx
@@ -6702,6 +6702,15 @@
       </w:r>
     </w:p>
     <w:p>
+      <w:r>
+        <w:rPr>
+          <w:rFonts w:ascii="Aptos" w:hAnsi="Aptos"/>
+          <w:color w:val="24323D"/>
+        </w:rPr>
+        <w:t>Le Ciel de la CCT désigne la continuité mobile entre les communs, non un centre qui les possède. Il relie un sol local de réserves, de savoirs, d’équipes et de recours à des veines de circulation, puis à des vecteurs adaptés : bateau ou barge quand les crues coupent les routes, véhicule terrestre ou relais humain ailleurs. Un vecteur ne compte que s’il ouvre une voie indépendante, protège l’accès vital sans condition et laisse après son départ davantage de capacité locale : pièces, réparation, fonds de secours et pouvoir de recours. Un bateau qui devient le seul canal de survie échoue au même test qu’un dépôt ou un fournisseur unique.</w:t>
+      </w:r>
+    </w:p>
+    <w:p>
       <w:pPr>
         <w:pStyle w:val="Heading2"/>
       </w:pPr>

</xml_diff>